<commit_message>
Copy edit QA list and strategy; remove meta sections and unexplained codes
Co-Authored-By: Claude Sonnet 5.5 <noreply@anthropic.com>
Claude-Session: https://claude.ai/code/session_018xgXLg3N1E9NDX9Z7KahFZ
</commit_message>
<xml_diff>
--- a/MDPM 883/Assignment 3/Deliverables_Objectives_and_Strategy.docx
+++ b/MDPM 883/Assignment 3/Deliverables_Objectives_and_Strategy.docx
@@ -131,7 +131,7 @@
         <w:pStyle w:val="Heading1"/>
       </w:pPr>
       <w:r>
-        <w:t>1. Read this first: what I could and could not check</w:t>
+        <w:t>1. Basis and limits</w:t>
       </w:r>
     </w:p>
     <w:p>
@@ -149,7 +149,7 @@
         <w:rPr>
           <w:b w:val="0"/>
         </w:rPr>
-        <w:t xml:space="preserve"> The only rubric evidence is the feedback table in Revision 2, which shows six criteria and a total of 100: Requirements 20, Task Model 20, Scenarios 20, Data Dictionary 10, User Characterization 10, Personas 20. Revision 2 also says “the rubric asks that the artefacts agree”. I used those as the rubric. If you have the real Grading Rubric text, send it and I will re-map section 5.</w:t>
+        <w:t xml:space="preserve"> The only rubric evidence is the feedback table in Revision 2, which shows six criteria and a total of 100: Requirements 20, Task Model 20, Scenarios 20, Data Dictionary 10, User Characterization 10, Personas 20. Revision 2 also says “the rubric asks that the artefacts agree”. These are used as the rubric. If you have the real Grading Rubric text, send it and it can be re-mapped section 3.</w:t>
       </w:r>
     </w:p>
     <w:p>
@@ -161,13 +161,13 @@
         <w:rPr>
           <w:b/>
         </w:rPr>
-        <w:t>I could not open the Figma Make file.</w:t>
+        <w:t>The Figma Make file could not be opened.</w:t>
       </w:r>
       <w:r>
         <w:rPr>
           <w:b w:val="0"/>
         </w:rPr>
-        <w:t xml:space="preserve"> The link returned “no edit access”. Nothing in the QA list is checked against the live file; every item stays marked “Check” until you walk Appendix A in the QA list. Share the file with edit or view access if you want that done for you.</w:t>
+        <w:t xml:space="preserve"> The link returned “no edit access”. Nothing in the QA list is checked against the live file; each item still needs confirming on screen with Appendix A of the QA list. Share the file with edit access to have it checked.</w:t>
       </w:r>
     </w:p>
     <w:p>
@@ -179,13 +179,13 @@
         <w:rPr>
           <w:b/>
         </w:rPr>
-        <w:t>Your uploaded Requirements Document is Revision 2 (5 October), which scored 86 out of 100 on its first submission.</w:t>
+        <w:t>Your uploaded Requirements Document is Revision 2 (5 October), a response to a first submission that scored 86 out of 100.</w:t>
       </w:r>
       <w:r>
         <w:rPr>
           <w:b w:val="0"/>
         </w:rPr>
-        <w:t xml:space="preserve"> I audited it directly (counts verified: 57 tasks, 43 lowest-level tasks all used in scenarios, 31 functional requirements with FR-31 the only one unused, scenario requirement counts correct). I have </w:t>
+        <w:t xml:space="preserve"> It was audited directly (counts verified: 57 tasks, 43 lowest-level tasks all used in scenarios, 31 functional requirements with FR-31 the only one unused, scenario requirement counts correct). Revision 2 itself has </w:t>
       </w:r>
       <w:r>
         <w:rPr>
@@ -197,7 +197,7 @@
         <w:rPr>
           <w:b w:val="0"/>
         </w:rPr>
-        <w:t xml:space="preserve"> rewritten Revision 2 itself: the changes in section 5 depend on decisions the team makes on Monday and on Cohen’s Wednesday answers, so they are written as drop-in edits to apply after the session.</w:t>
+        <w:t xml:space="preserve"> been rewritten: the changes in section 3 depend on decisions the team makes on Monday and on Cohen’s Wednesday answers, so they are written as drop-in edits to apply after the session.</w:t>
       </w:r>
     </w:p>
     <w:p>
@@ -205,267 +205,7 @@
         <w:pStyle w:val="Heading1"/>
       </w:pPr>
       <w:r>
-        <w:t>2. The three documents you gave me</w:t>
-      </w:r>
-    </w:p>
-    <w:tbl>
-      <w:tblPr>
-        <w:tblStyle w:val="TableGrid"/>
-        <w:tblW w:type="auto" w:w="0"/>
-        <w:jc w:val="center"/>
-        <w:tblLayout w:type="fixed"/>
-        <w:tblLook w:firstColumn="1" w:firstRow="1" w:lastColumn="0" w:lastRow="0" w:noHBand="0" w:noVBand="1" w:val="04A0"/>
-      </w:tblPr>
-      <w:tblGrid>
-        <w:gridCol w:w="3312"/>
-        <w:gridCol w:w="3312"/>
-        <w:gridCol w:w="3312"/>
-      </w:tblGrid>
-      <w:tr>
-        <w:trPr>
-          <w:tblHeader w:val="true"/>
-        </w:trPr>
-        <w:tc>
-          <w:tcPr>
-            <w:tcW w:type="dxa" w:w="2880"/>
-            <w:shd w:val="clear" w:color="auto" w:fill="1F3A5F"/>
-          </w:tcPr>
-          <w:p>
-            <w:r/>
-            <w:r>
-              <w:rPr>
-                <w:b/>
-                <w:color w:val="FFFFFF"/>
-                <w:sz w:val="19"/>
-              </w:rPr>
-              <w:t>Document</w:t>
-            </w:r>
-          </w:p>
-        </w:tc>
-        <w:tc>
-          <w:tcPr>
-            <w:tcW w:type="dxa" w:w="4752"/>
-            <w:shd w:val="clear" w:color="auto" w:fill="1F3A5F"/>
-          </w:tcPr>
-          <w:p>
-            <w:r/>
-            <w:r>
-              <w:rPr>
-                <w:b/>
-                <w:color w:val="FFFFFF"/>
-                <w:sz w:val="19"/>
-              </w:rPr>
-              <w:t>What it is</w:t>
-            </w:r>
-          </w:p>
-        </w:tc>
-        <w:tc>
-          <w:tcPr>
-            <w:tcW w:type="dxa" w:w="2304"/>
-            <w:shd w:val="clear" w:color="auto" w:fill="1F3A5F"/>
-          </w:tcPr>
-          <w:p>
-            <w:r/>
-            <w:r>
-              <w:rPr>
-                <w:b/>
-                <w:color w:val="FFFFFF"/>
-                <w:sz w:val="19"/>
-              </w:rPr>
-              <w:t>Status</w:t>
-            </w:r>
-          </w:p>
-        </w:tc>
-      </w:tr>
-      <w:tr>
-        <w:trPr>
-          <w:cantSplit w:val="true"/>
-        </w:trPr>
-        <w:tc>
-          <w:tcPr>
-            <w:tcW w:type="dxa" w:w="2880"/>
-          </w:tcPr>
-          <w:p>
-            <w:pPr>
-              <w:spacing w:after="40"/>
-            </w:pPr>
-            <w:r/>
-            <w:r>
-              <w:rPr>
-                <w:b w:val="0"/>
-                <w:sz w:val="19"/>
-              </w:rPr>
-              <w:t>QA List: Scenarios 1 and 2 (one-page-style list)</w:t>
-            </w:r>
-          </w:p>
-        </w:tc>
-        <w:tc>
-          <w:tcPr>
-            <w:tcW w:type="dxa" w:w="4752"/>
-          </w:tcPr>
-          <w:p>
-            <w:pPr>
-              <w:spacing w:after="40"/>
-            </w:pPr>
-            <w:r/>
-            <w:r>
-              <w:rPr>
-                <w:b w:val="0"/>
-                <w:sz w:val="19"/>
-              </w:rPr>
-              <w:t>The short register: 33 items with issue, evidence, validation, change and priority, plus decisions and Cohen questions.</w:t>
-            </w:r>
-          </w:p>
-        </w:tc>
-        <w:tc>
-          <w:tcPr>
-            <w:tcW w:type="dxa" w:w="2304"/>
-          </w:tcPr>
-          <w:p>
-            <w:pPr>
-              <w:spacing w:after="40"/>
-            </w:pPr>
-            <w:r/>
-            <w:r>
-              <w:rPr>
-                <w:b w:val="0"/>
-                <w:sz w:val="19"/>
-              </w:rPr>
-              <w:t>Good content, but tags are used inconsistently (see section 4).</w:t>
-            </w:r>
-          </w:p>
-        </w:tc>
-      </w:tr>
-      <w:tr>
-        <w:trPr>
-          <w:cantSplit w:val="true"/>
-        </w:trPr>
-        <w:tc>
-          <w:tcPr>
-            <w:tcW w:type="dxa" w:w="2880"/>
-          </w:tcPr>
-          <w:p>
-            <w:pPr>
-              <w:spacing w:after="40"/>
-            </w:pPr>
-            <w:r/>
-            <w:r>
-              <w:rPr>
-                <w:b w:val="0"/>
-                <w:sz w:val="19"/>
-              </w:rPr>
-              <w:t>Workflow QA Pass (long form)</w:t>
-            </w:r>
-          </w:p>
-        </w:tc>
-        <w:tc>
-          <w:tcPr>
-            <w:tcW w:type="dxa" w:w="4752"/>
-          </w:tcPr>
-          <w:p>
-            <w:pPr>
-              <w:spacing w:after="40"/>
-            </w:pPr>
-            <w:r/>
-            <w:r>
-              <w:rPr>
-                <w:b w:val="0"/>
-                <w:sz w:val="19"/>
-              </w:rPr>
-              <w:t>The same 33 items with meeting references, the mandate, method, validation plan and Requirements Document impact.</w:t>
-            </w:r>
-          </w:p>
-        </w:tc>
-        <w:tc>
-          <w:tcPr>
-            <w:tcW w:type="dxa" w:w="2304"/>
-          </w:tcPr>
-          <w:p>
-            <w:pPr>
-              <w:spacing w:after="40"/>
-            </w:pPr>
-            <w:r/>
-            <w:r>
-              <w:rPr>
-                <w:b w:val="0"/>
-                <w:sz w:val="19"/>
-              </w:rPr>
-              <w:t>The fuller source of truth. Too long to run a 10-minute session from.</w:t>
-            </w:r>
-          </w:p>
-        </w:tc>
-      </w:tr>
-      <w:tr>
-        <w:trPr>
-          <w:cantSplit w:val="true"/>
-        </w:trPr>
-        <w:tc>
-          <w:tcPr>
-            <w:tcW w:type="dxa" w:w="2880"/>
-          </w:tcPr>
-          <w:p>
-            <w:pPr>
-              <w:spacing w:after="40"/>
-            </w:pPr>
-            <w:r/>
-            <w:r>
-              <w:rPr>
-                <w:b w:val="0"/>
-                <w:sz w:val="19"/>
-              </w:rPr>
-              <w:t>Requirements Document, Revision 2</w:t>
-            </w:r>
-          </w:p>
-        </w:tc>
-        <w:tc>
-          <w:tcPr>
-            <w:tcW w:type="dxa" w:w="4752"/>
-          </w:tcPr>
-          <w:p>
-            <w:pPr>
-              <w:spacing w:after="40"/>
-            </w:pPr>
-            <w:r/>
-            <w:r>
-              <w:rPr>
-                <w:b w:val="0"/>
-                <w:sz w:val="19"/>
-              </w:rPr>
-              <w:t>The 18 October artefact: requirements, task model, scenarios, data dictionary, user characterization, personas, consistency check.</w:t>
-            </w:r>
-          </w:p>
-        </w:tc>
-        <w:tc>
-          <w:tcPr>
-            <w:tcW w:type="dxa" w:w="2304"/>
-          </w:tcPr>
-          <w:p>
-            <w:pPr>
-              <w:spacing w:after="40"/>
-            </w:pPr>
-            <w:r/>
-            <w:r>
-              <w:rPr>
-                <w:b w:val="0"/>
-                <w:sz w:val="19"/>
-              </w:rPr>
-              <w:t>Strong, with specific gaps (section 5) and open items that wait on the QA outcomes.</w:t>
-            </w:r>
-          </w:p>
-        </w:tc>
-      </w:tr>
-    </w:tbl>
-    <w:p>
-      <w:pPr>
-        <w:spacing w:after="40"/>
-      </w:pPr>
-    </w:p>
-    <w:p>
-      <w:pPr>
-        <w:pStyle w:val="Heading1"/>
-      </w:pPr>
-      <w:r>
-        <w:t>3. Objectives and expectations, deliverable by deliverable</w:t>
+        <w:t>2. Objectives and expectations, deliverable by deliverable</w:t>
       </w:r>
     </w:p>
     <w:p>
@@ -473,7 +213,7 @@
         <w:pStyle w:val="Heading2"/>
       </w:pPr>
       <w:r>
-        <w:t>3.1 The QA list (due Monday 5 October, Action A5)</w:t>
+        <w:t>2.1 The QA list (due Monday 5 October, Action A5)</w:t>
       </w:r>
     </w:p>
     <w:p>
@@ -808,7 +548,7 @@
         <w:pStyle w:val="Heading2"/>
       </w:pPr>
       <w:r>
-        <w:t>3.2 The Requirements Document (18 October submission, Dr. Sara Nabil)</w:t>
+        <w:t>2.2 The Requirements Document (18 October submission, Dr. Sara Nabil)</w:t>
       </w:r>
     </w:p>
     <w:p>
@@ -825,7 +565,7 @@
         <w:pStyle w:val="Heading2"/>
       </w:pPr>
       <w:r>
-        <w:t>3.3 The prototype, video and briefing (what the QA list protects)</w:t>
+        <w:t>2.3 The prototype, video and briefing (what the QA list protects)</w:t>
       </w:r>
     </w:p>
     <w:p>
@@ -869,517 +609,7 @@
         <w:pStyle w:val="Heading1"/>
       </w:pPr>
       <w:r>
-        <w:t>4. Problems found in the QA material itself (fixed in the clean list)</w:t>
-      </w:r>
-    </w:p>
-    <w:tbl>
-      <w:tblPr>
-        <w:tblStyle w:val="TableGrid"/>
-        <w:tblW w:type="auto" w:w="0"/>
-        <w:jc w:val="center"/>
-        <w:tblLayout w:type="fixed"/>
-        <w:tblLook w:firstColumn="1" w:firstRow="1" w:lastColumn="0" w:lastRow="0" w:noHBand="0" w:noVBand="1" w:val="04A0"/>
-      </w:tblPr>
-      <w:tblGrid>
-        <w:gridCol w:w="3312"/>
-        <w:gridCol w:w="3312"/>
-        <w:gridCol w:w="3312"/>
-      </w:tblGrid>
-      <w:tr>
-        <w:trPr>
-          <w:tblHeader w:val="true"/>
-        </w:trPr>
-        <w:tc>
-          <w:tcPr>
-            <w:tcW w:type="dxa" w:w="4896"/>
-            <w:shd w:val="clear" w:color="auto" w:fill="1F3A5F"/>
-          </w:tcPr>
-          <w:p>
-            <w:r/>
-            <w:r>
-              <w:rPr>
-                <w:b/>
-                <w:color w:val="FFFFFF"/>
-                <w:sz w:val="18"/>
-              </w:rPr>
-              <w:t>Problem</w:t>
-            </w:r>
-          </w:p>
-        </w:tc>
-        <w:tc>
-          <w:tcPr>
-            <w:tcW w:type="dxa" w:w="1872"/>
-            <w:shd w:val="clear" w:color="auto" w:fill="1F3A5F"/>
-          </w:tcPr>
-          <w:p>
-            <w:r/>
-            <w:r>
-              <w:rPr>
-                <w:b/>
-                <w:color w:val="FFFFFF"/>
-                <w:sz w:val="18"/>
-              </w:rPr>
-              <w:t>Where</w:t>
-            </w:r>
-          </w:p>
-        </w:tc>
-        <w:tc>
-          <w:tcPr>
-            <w:tcW w:type="dxa" w:w="3168"/>
-            <w:shd w:val="clear" w:color="auto" w:fill="1F3A5F"/>
-          </w:tcPr>
-          <w:p>
-            <w:r/>
-            <w:r>
-              <w:rPr>
-                <w:b/>
-                <w:color w:val="FFFFFF"/>
-                <w:sz w:val="18"/>
-              </w:rPr>
-              <w:t>Fix in the new list</w:t>
-            </w:r>
-          </w:p>
-        </w:tc>
-      </w:tr>
-      <w:tr>
-        <w:trPr>
-          <w:cantSplit w:val="true"/>
-        </w:trPr>
-        <w:tc>
-          <w:tcPr>
-            <w:tcW w:type="dxa" w:w="4896"/>
-          </w:tcPr>
-          <w:p>
-            <w:pPr>
-              <w:spacing w:after="40"/>
-            </w:pPr>
-            <w:r/>
-            <w:r>
-              <w:rPr>
-                <w:b w:val="0"/>
-                <w:sz w:val="18"/>
-              </w:rPr>
-              <w:t>“Confirmed” is defined as two or more independent sources, but the short list marks items Confirmed on the strength of the Guiding Scenario alone (items 2.1, 2.9) and a “confirmed need” inside an assumption (2.8).</w:t>
-            </w:r>
-          </w:p>
-        </w:tc>
-        <w:tc>
-          <w:tcPr>
-            <w:tcW w:type="dxa" w:w="1872"/>
-          </w:tcPr>
-          <w:p>
-            <w:pPr>
-              <w:spacing w:after="40"/>
-            </w:pPr>
-            <w:r/>
-            <w:r>
-              <w:rPr>
-                <w:b w:val="0"/>
-                <w:sz w:val="18"/>
-              </w:rPr>
-              <w:t>Short list, evidence column</w:t>
-            </w:r>
-          </w:p>
-        </w:tc>
-        <w:tc>
-          <w:tcPr>
-            <w:tcW w:type="dxa" w:w="3168"/>
-          </w:tcPr>
-          <w:p>
-            <w:pPr>
-              <w:spacing w:after="40"/>
-            </w:pPr>
-            <w:r/>
-            <w:r>
-              <w:rPr>
-                <w:b w:val="0"/>
-                <w:sz w:val="18"/>
-              </w:rPr>
-              <w:t xml:space="preserve">Guiding Scenario is tagged </w:t>
-            </w:r>
-            <w:r>
-              <w:rPr>
-                <w:b/>
-                <w:sz w:val="18"/>
-              </w:rPr>
-              <w:t>TS</w:t>
-            </w:r>
-            <w:r>
-              <w:rPr>
-                <w:b w:val="0"/>
-                <w:sz w:val="18"/>
-              </w:rPr>
-              <w:t xml:space="preserve"> (team source, not user evidence). 2.9 is Confirmed on the 1 October record instead.</w:t>
-            </w:r>
-          </w:p>
-        </w:tc>
-      </w:tr>
-      <w:tr>
-        <w:trPr>
-          <w:cantSplit w:val="true"/>
-        </w:trPr>
-        <w:tc>
-          <w:tcPr>
-            <w:tcW w:type="dxa" w:w="4896"/>
-          </w:tcPr>
-          <w:p>
-            <w:pPr>
-              <w:spacing w:after="40"/>
-            </w:pPr>
-            <w:r/>
-            <w:r>
-              <w:rPr>
-                <w:b w:val="0"/>
-                <w:sz w:val="18"/>
-              </w:rPr>
-              <w:t>Two tag vocabularies (Confirmed / Single source / Hypothesis / Assumption versus C / S / H / A) and a third pair for team decisions.</w:t>
-            </w:r>
-          </w:p>
-        </w:tc>
-        <w:tc>
-          <w:tcPr>
-            <w:tcW w:type="dxa" w:w="1872"/>
-          </w:tcPr>
-          <w:p>
-            <w:pPr>
-              <w:spacing w:after="40"/>
-            </w:pPr>
-            <w:r/>
-            <w:r>
-              <w:rPr>
-                <w:b w:val="0"/>
-                <w:sz w:val="18"/>
-              </w:rPr>
-              <w:t>Both documents</w:t>
-            </w:r>
-          </w:p>
-        </w:tc>
-        <w:tc>
-          <w:tcPr>
-            <w:tcW w:type="dxa" w:w="3168"/>
-          </w:tcPr>
-          <w:p>
-            <w:pPr>
-              <w:spacing w:after="40"/>
-            </w:pPr>
-            <w:r/>
-            <w:r>
-              <w:rPr>
-                <w:b w:val="0"/>
-                <w:sz w:val="18"/>
-              </w:rPr>
-              <w:t>One set: C, S, H, A, TD, TS, N/A, defined once.</w:t>
-            </w:r>
-          </w:p>
-        </w:tc>
-      </w:tr>
-      <w:tr>
-        <w:trPr>
-          <w:cantSplit w:val="true"/>
-        </w:trPr>
-        <w:tc>
-          <w:tcPr>
-            <w:tcW w:type="dxa" w:w="4896"/>
-          </w:tcPr>
-          <w:p>
-            <w:pPr>
-              <w:spacing w:after="40"/>
-            </w:pPr>
-            <w:r/>
-            <w:r>
-              <w:rPr>
-                <w:b w:val="0"/>
-                <w:sz w:val="18"/>
-              </w:rPr>
-              <w:t>Item 1.9 shows “Consistency. Not an evidence question” in the evidence column.</w:t>
-            </w:r>
-          </w:p>
-        </w:tc>
-        <w:tc>
-          <w:tcPr>
-            <w:tcW w:type="dxa" w:w="1872"/>
-          </w:tcPr>
-          <w:p>
-            <w:pPr>
-              <w:spacing w:after="40"/>
-            </w:pPr>
-            <w:r/>
-            <w:r>
-              <w:rPr>
-                <w:b w:val="0"/>
-                <w:sz w:val="18"/>
-              </w:rPr>
-              <w:t>Short list</w:t>
-            </w:r>
-          </w:p>
-        </w:tc>
-        <w:tc>
-          <w:tcPr>
-            <w:tcW w:type="dxa" w:w="3168"/>
-          </w:tcPr>
-          <w:p>
-            <w:pPr>
-              <w:spacing w:after="40"/>
-            </w:pPr>
-            <w:r/>
-            <w:r>
-              <w:rPr>
-                <w:b w:val="0"/>
-                <w:sz w:val="18"/>
-              </w:rPr>
-              <w:t>Tagged N/A.</w:t>
-            </w:r>
-          </w:p>
-        </w:tc>
-      </w:tr>
-      <w:tr>
-        <w:trPr>
-          <w:cantSplit w:val="true"/>
-        </w:trPr>
-        <w:tc>
-          <w:tcPr>
-            <w:tcW w:type="dxa" w:w="4896"/>
-          </w:tcPr>
-          <w:p>
-            <w:pPr>
-              <w:spacing w:after="40"/>
-            </w:pPr>
-            <w:r/>
-            <w:r>
-              <w:rPr>
-                <w:b w:val="0"/>
-                <w:sz w:val="18"/>
-              </w:rPr>
-              <w:t>Item 2.8 recommends “Awaiting initial review, not yet assigned” in one document and “In request coordinator queue, not yet assigned” in the other; 1.11 and 2.1 disagree about where Scenario 1 ends and Scenario 2 begins.</w:t>
-            </w:r>
-          </w:p>
-        </w:tc>
-        <w:tc>
-          <w:tcPr>
-            <w:tcW w:type="dxa" w:w="1872"/>
-          </w:tcPr>
-          <w:p>
-            <w:pPr>
-              <w:spacing w:after="40"/>
-            </w:pPr>
-            <w:r/>
-            <w:r>
-              <w:rPr>
-                <w:b w:val="0"/>
-                <w:sz w:val="18"/>
-              </w:rPr>
-              <w:t>Both documents</w:t>
-            </w:r>
-          </w:p>
-        </w:tc>
-        <w:tc>
-          <w:tcPr>
-            <w:tcW w:type="dxa" w:w="3168"/>
-          </w:tcPr>
-          <w:p>
-            <w:pPr>
-              <w:spacing w:after="40"/>
-            </w:pPr>
-            <w:r/>
-            <w:r>
-              <w:rPr>
-                <w:b w:val="0"/>
-                <w:sz w:val="18"/>
-              </w:rPr>
-              <w:t>One wording; Scenario 1 ends on the Submitted page, Scenario 2 begins from it.</w:t>
-            </w:r>
-          </w:p>
-        </w:tc>
-      </w:tr>
-      <w:tr>
-        <w:trPr>
-          <w:cantSplit w:val="true"/>
-        </w:trPr>
-        <w:tc>
-          <w:tcPr>
-            <w:tcW w:type="dxa" w:w="4896"/>
-          </w:tcPr>
-          <w:p>
-            <w:pPr>
-              <w:spacing w:after="40"/>
-            </w:pPr>
-            <w:r/>
-            <w:r>
-              <w:rPr>
-                <w:b w:val="0"/>
-                <w:sz w:val="18"/>
-              </w:rPr>
-              <w:t>No owner on the record for items 2.2, 3.2, 3.3, 3.7 and no fallback if Cohen answers the other way.</w:t>
-            </w:r>
-          </w:p>
-        </w:tc>
-        <w:tc>
-          <w:tcPr>
-            <w:tcW w:type="dxa" w:w="1872"/>
-          </w:tcPr>
-          <w:p>
-            <w:pPr>
-              <w:spacing w:after="40"/>
-            </w:pPr>
-            <w:r/>
-            <w:r>
-              <w:rPr>
-                <w:b w:val="0"/>
-                <w:sz w:val="18"/>
-              </w:rPr>
-              <w:t>Both</w:t>
-            </w:r>
-          </w:p>
-        </w:tc>
-        <w:tc>
-          <w:tcPr>
-            <w:tcW w:type="dxa" w:w="3168"/>
-          </w:tcPr>
-          <w:p>
-            <w:pPr>
-              <w:spacing w:after="40"/>
-            </w:pPr>
-            <w:r/>
-            <w:r>
-              <w:rPr>
-                <w:b w:val="0"/>
-                <w:sz w:val="18"/>
-              </w:rPr>
-              <w:t>Added a Proposed owner column and an “If the answer is…” column on the Cohen questions.</w:t>
-            </w:r>
-          </w:p>
-        </w:tc>
-      </w:tr>
-      <w:tr>
-        <w:trPr>
-          <w:cantSplit w:val="true"/>
-        </w:trPr>
-        <w:tc>
-          <w:tcPr>
-            <w:tcW w:type="dxa" w:w="4896"/>
-          </w:tcPr>
-          <w:p>
-            <w:pPr>
-              <w:spacing w:after="40"/>
-            </w:pPr>
-            <w:r/>
-            <w:r>
-              <w:rPr>
-                <w:b w:val="0"/>
-                <w:sz w:val="18"/>
-              </w:rPr>
-              <w:t>The long form is too long to run a ten-minute session from; the short list does not say what the meeting should decide first.</w:t>
-            </w:r>
-          </w:p>
-        </w:tc>
-        <w:tc>
-          <w:tcPr>
-            <w:tcW w:type="dxa" w:w="1872"/>
-          </w:tcPr>
-          <w:p>
-            <w:pPr>
-              <w:spacing w:after="40"/>
-            </w:pPr>
-            <w:r/>
-            <w:r>
-              <w:rPr>
-                <w:b w:val="0"/>
-                <w:sz w:val="18"/>
-              </w:rPr>
-              <w:t>Both</w:t>
-            </w:r>
-          </w:p>
-        </w:tc>
-        <w:tc>
-          <w:tcPr>
-            <w:tcW w:type="dxa" w:w="3168"/>
-          </w:tcPr>
-          <w:p>
-            <w:pPr>
-              <w:spacing w:after="40"/>
-            </w:pPr>
-            <w:r/>
-            <w:r>
-              <w:rPr>
-                <w:b w:val="0"/>
-                <w:sz w:val="18"/>
-              </w:rPr>
-              <w:t>Decisions sit second, before the register, with the cost of not deciding.</w:t>
-            </w:r>
-          </w:p>
-        </w:tc>
-      </w:tr>
-      <w:tr>
-        <w:trPr>
-          <w:cantSplit w:val="true"/>
-        </w:trPr>
-        <w:tc>
-          <w:tcPr>
-            <w:tcW w:type="dxa" w:w="4896"/>
-          </w:tcPr>
-          <w:p>
-            <w:pPr>
-              <w:spacing w:after="40"/>
-            </w:pPr>
-            <w:r/>
-            <w:r>
-              <w:rPr>
-                <w:b w:val="0"/>
-                <w:sz w:val="18"/>
-              </w:rPr>
-              <w:t>The Revision 2 data dictionary, FR-14 and FR-15 do not yet match the QA recommendations (Submit Confirmation lacks stage, holder and next step; Request Status values differ from the four stages).</w:t>
-            </w:r>
-          </w:p>
-        </w:tc>
-        <w:tc>
-          <w:tcPr>
-            <w:tcW w:type="dxa" w:w="1872"/>
-          </w:tcPr>
-          <w:p>
-            <w:pPr>
-              <w:spacing w:after="40"/>
-            </w:pPr>
-            <w:r/>
-            <w:r>
-              <w:rPr>
-                <w:b w:val="0"/>
-                <w:sz w:val="18"/>
-              </w:rPr>
-              <w:t>Requirements Document</w:t>
-            </w:r>
-          </w:p>
-        </w:tc>
-        <w:tc>
-          <w:tcPr>
-            <w:tcW w:type="dxa" w:w="3168"/>
-          </w:tcPr>
-          <w:p>
-            <w:pPr>
-              <w:spacing w:after="40"/>
-            </w:pPr>
-            <w:r/>
-            <w:r>
-              <w:rPr>
-                <w:b w:val="0"/>
-                <w:sz w:val="18"/>
-              </w:rPr>
-              <w:t>Listed as concrete edits in section 5 and in QA list Part 7.</w:t>
-            </w:r>
-          </w:p>
-        </w:tc>
-      </w:tr>
-    </w:tbl>
-    <w:p>
-      <w:pPr>
-        <w:spacing w:after="40"/>
-      </w:pPr>
-    </w:p>
-    <w:p>
-      <w:pPr>
-        <w:pStyle w:val="Heading1"/>
-      </w:pPr>
-      <w:r>
-        <w:t>5. Upgrading the Requirements Document to “excellent”</w:t>
+        <w:t>3. Upgrading the Requirements Document to “excellent”</w:t>
       </w:r>
     </w:p>
     <w:p>
@@ -1388,7 +618,7 @@
           <w:b w:val="0"/>
           <w:sz w:val="20"/>
         </w:rPr>
-        <w:t>Rubric criteria in the order of the feedback table, with the current mark, what is still weak, and the exact edit to make. Marks shown are those awarded on the first submission; I make no claim about the revised score.</w:t>
+        <w:t>Rubric criteria in the order of the feedback table, with the current mark, what is still weak, and the exact edit to make. Marks shown are those awarded on the first submission; No claim is made about the revised score.</w:t>
       </w:r>
     </w:p>
     <w:p>
@@ -1396,7 +626,7 @@
         <w:pStyle w:val="Heading2"/>
       </w:pPr>
       <w:r>
-        <w:t>5.1 Requirements (18 / 20)</w:t>
+        <w:t>3.1 Requirements (18 / 20)</w:t>
       </w:r>
     </w:p>
     <w:p>
@@ -1565,7 +795,7 @@
         <w:pStyle w:val="Heading2"/>
       </w:pPr>
       <w:r>
-        <w:t>5.2 Task Model (18 / 20)</w:t>
+        <w:t>3.2 Task Model (18 / 20)</w:t>
       </w:r>
     </w:p>
     <w:p>
@@ -1633,7 +863,7 @@
           <w:b w:val="0"/>
           <w:sz w:val="19"/>
         </w:rPr>
-        <w:t xml:space="preserve"> add that the requester waits for a notification between submission and the proposal, then does 5.8 (QA Part 7).</w:t>
+        <w:t xml:space="preserve"> add that the requester waits for a notification between submission and the proposal, then does 5.8 (QA list, section 7).</w:t>
       </w:r>
     </w:p>
     <w:p>
@@ -1674,7 +904,7 @@
         <w:pStyle w:val="Heading2"/>
       </w:pPr>
       <w:r>
-        <w:t>5.3 Scenarios (18 / 20)</w:t>
+        <w:t>3.3 Scenarios (18 / 20)</w:t>
       </w:r>
     </w:p>
     <w:p>
@@ -1727,7 +957,7 @@
           <w:b w:val="0"/>
           <w:sz w:val="19"/>
         </w:rPr>
-        <w:t>Keep the 14-chair McDougall Centre case as the single thread across Scenarios 3 and 7 and in the prototype (QA 3.2). Confirm in section 8 that Kevin on the screens is Kevin Sato and Joy is the Furniture Coordinator.</w:t>
+        <w:t>Keep the 14-chair McDougall Centre case as the single thread across Scenarios 3 and 7 and in the prototype (QA 3.2). Confirm in section 8 of the Requirements Document that Kevin on the screens is Kevin Sato and Joy is the Furniture Coordinator.</w:t>
       </w:r>
     </w:p>
     <w:p>
@@ -1748,7 +978,7 @@
         <w:pStyle w:val="Heading2"/>
       </w:pPr>
       <w:r>
-        <w:t>5.4 Data Dictionary (10 / 10): protect it</w:t>
+        <w:t>3.4 Data Dictionary (10 / 10): protect it</w:t>
       </w:r>
     </w:p>
     <w:p>
@@ -1809,7 +1039,7 @@
         <w:pStyle w:val="Heading2"/>
       </w:pPr>
       <w:r>
-        <w:t>5.5 User Characterization (5 / 10): the biggest remaining gain</w:t>
+        <w:t>3.5 User Characterization (5 / 10): the biggest remaining gain</w:t>
       </w:r>
     </w:p>
     <w:p>
@@ -1836,7 +1066,7 @@
           <w:b w:val="0"/>
           <w:sz w:val="19"/>
         </w:rPr>
-        <w:t xml:space="preserve"> plainly in 6.1 (two CMACs interviewed, rest relayed), and keep section 6.3 as a dated plan with owners.</w:t>
+        <w:t xml:space="preserve"> plainly in section 6.1 of the Requirements Document (two CMACs interviewed, rest relayed), and keep section 6.3 as a dated plan with owners.</w:t>
       </w:r>
     </w:p>
     <w:p>
@@ -1869,7 +1099,7 @@
           <w:b w:val="0"/>
           <w:sz w:val="19"/>
         </w:rPr>
-        <w:t>Add the QA facts: use frequency differs, long-serving users may be habituated, and the client is a stakeholder but not a user in this version (QA Part 7).</w:t>
+        <w:t>Add the QA facts: use frequency differs, long-serving users may be habituated, and the client is a stakeholder but not a user in this version (QA list, section 7).</w:t>
       </w:r>
     </w:p>
     <w:p>
@@ -1897,7 +1127,7 @@
         <w:pStyle w:val="Heading2"/>
       </w:pPr>
       <w:r>
-        <w:t>5.6 Personas (17 / 20)</w:t>
+        <w:t>3.6 Personas (17 / 20)</w:t>
       </w:r>
     </w:p>
     <w:p>
@@ -1958,7 +1188,7 @@
         <w:pStyle w:val="Heading2"/>
       </w:pPr>
       <w:r>
-        <w:t>5.7 Artefact agreement (the rubric’s consistency test)</w:t>
+        <w:t>3.7 Artefact agreement (the rubric’s consistency test)</w:t>
       </w:r>
     </w:p>
     <w:p>
@@ -1978,7 +1208,7 @@
           <w:b/>
           <w:sz w:val="19"/>
         </w:rPr>
-        <w:t>traceability row to section 8</w:t>
+        <w:t>traceability row to section 8 of the Requirements Document</w:t>
       </w:r>
       <w:r>
         <w:rPr>
@@ -1998,7 +1228,7 @@
           <w:b w:val="0"/>
           <w:sz w:val="19"/>
         </w:rPr>
-        <w:t>Close the three open checks listed at the end of section 8: Request Type list (O1), Workflow Stage names (O2), and Kevin and Joy naming.</w:t>
+        <w:t>Close the three open checks listed at the end of its section 8: Request Type list (O1), Workflow Stage names (O2), and Kevin and Joy naming.</w:t>
       </w:r>
     </w:p>
     <w:p>
@@ -2019,7 +1249,7 @@
         <w:pStyle w:val="Heading1"/>
       </w:pPr>
       <w:r>
-        <w:t>6. Step-by-step strategy</w:t>
+        <w:t>4. Step-by-step strategy</w:t>
       </w:r>
     </w:p>
     <w:tbl>
@@ -2186,7 +1416,7 @@
                 <w:b w:val="0"/>
                 <w:sz w:val="18"/>
               </w:rPr>
-              <w:t>5. State the three findings (QA Part 1) in under two minutes. 6. Go straight to the eight decisions (QA Part 2), one at a time; do not read the register out. 7. As scribe, record each decision with one owner and a date. 8. Collect corrections to the 1 and 3 October summaries.</w:t>
+              <w:t>5. State the three findings (QA list, section 1) in under two minutes. 6. Go straight to the eight decisions (QA list, section 2), one at a time; do not read the register out. 7. As scribe, record each decision with one owner and a date. 8. Collect corrections to the 1 and 3 October summaries.</w:t>
             </w:r>
           </w:p>
         </w:tc>
@@ -2422,7 +1652,7 @@
                 <w:b w:val="0"/>
                 <w:sz w:val="18"/>
               </w:rPr>
-              <w:t>16. Second QA pass on the rebuilt screens. 17. Check Scenario 2 is as complete as Scenario 1 (item 3.5). 18. Apply the section 5 edits to the Requirements Document as Revision 3.</w:t>
+              <w:t>16. Second QA pass on the rebuilt screens. 17. Check Scenario 2 is as complete as Scenario 1 (item 3.5). 18. Apply the section 3 edits to the Requirements Document as Revision 3.</w:t>
             </w:r>
           </w:p>
         </w:tc>
@@ -2481,7 +1711,7 @@
                 <w:b w:val="0"/>
                 <w:sz w:val="18"/>
               </w:rPr>
-              <w:t>19. Usability test on Q1 to Q4 (QA Part 6.2). 20. Final consistency check across requirements, task model, scenarios, data dictionary, characterization, personas, prototype and video. 21. Submit.</w:t>
+              <w:t>19. Usability test on Q1 to Q4 (QA list, section 6.2). 20. Final consistency check across requirements, task model, scenarios, data dictionary, characterization, personas, prototype and video. 21. Submit.</w:t>
             </w:r>
           </w:p>
         </w:tc>
@@ -2515,7 +1745,7 @@
         <w:pStyle w:val="Heading1"/>
       </w:pPr>
       <w:r>
-        <w:t>7. Risks to watch</w:t>
+        <w:t>5. Risks to watch</w:t>
       </w:r>
     </w:p>
     <w:tbl>

</xml_diff>